<commit_message>
Revise RABC reply: no signature block, buyer-led model selection, payment after contract, lead time and capacity, AC piping
Co-Authored-By: Claude Opus 5.5 <noreply@anthropic.com>
Claude-Session: https://claude.ai/code/session_01Ni3wtRpXsBaaw8voUTrb9J
</commit_message>
<xml_diff>
--- a/reports/رد على خطاب RABC.docx
+++ b/reports/رد على خطاب RABC.docx
@@ -139,7 +139,7 @@
         <w:rPr>
           <w:rtl/>
         </w:rPr>
-        <w:t xml:space="preserve">نرغب في الحصول على وكالة رسمية لمنتجات المصانع التي تمثلونها في المملكة العربية السعودية، ونرجو إفادتنا بشروط الوكالة، وهل هي حصرية، ومدتها، والأهداف المطلوبة منا.</w:t>
+        <w:t xml:space="preserve">نرغب في الحصول على وكالة رسمية لمنتجات المصانع التي تمثلونها في المملكة العربية السعودية. وآلية العمل التي نقترحها أن ترسلوا لنا جميع الأشكال والنماذج المتوفرة، ونختار منها ما يناسب السوق السعودي.</w:t>
       </w:r>
     </w:p>
     <w:p>
@@ -169,7 +169,7 @@
         <w:rPr>
           <w:rtl/>
         </w:rPr>
-        <w:t xml:space="preserve">نطلب إرسال عينات من أغلب المنتجات إلى المملكة لعرضها على العملاء واختبارها في الظروف المناخية المحلية. ونرجو توضيح تكلفة العينات وشروط شحنها، ومن يتحمل هذه التكلفة.</w:t>
+        <w:t xml:space="preserve">نطلب إرسال عينات من أغلب المنتجات المختارة إلى المملكة لعرضها على العملاء واختبارها في الظروف المناخية المحلية.</w:t>
       </w:r>
     </w:p>
     <w:p>
@@ -200,6 +200,36 @@
           <w:rtl/>
         </w:rPr>
         <w:t xml:space="preserve">نتولى نحن التسويق والبيع للعملاء داخل المملكة، والتنسيق مع العملاء بعد البيع.</w:t>
+      </w:r>
+    </w:p>
+    <w:p>
+      <w:pPr>
+        <w:numPr>
+          <w:ilvl w:val="0"/>
+          <w:numId w:val="1001"/>
+        </w:numPr>
+        <w:pStyle w:val="Compact"/>
+        <w:bidi/>
+      </w:pPr>
+      <w:r>
+        <w:rPr>
+          <w:rtl/>
+          <w:bCs/>
+          <w:b/>
+        </w:rPr>
+        <w:t xml:space="preserve">الدفع:</w:t>
+      </w:r>
+      <w:r>
+        <w:rPr>
+          <w:rtl/>
+        </w:rPr>
+        <w:t xml:space="preserve"> </w:t>
+      </w:r>
+      <w:r>
+        <w:rPr>
+          <w:rtl/>
+        </w:rPr>
+        <w:t xml:space="preserve">يكون الدفع بعد التعاقد.</w:t>
       </w:r>
     </w:p>
     <w:bookmarkEnd w:id="20"/>
@@ -760,7 +790,7 @@
           <w:bCs/>
           <w:b/>
         </w:rPr>
-        <w:t xml:space="preserve">التكييف والتهوية والسباكة:</w:t>
+        <w:t xml:space="preserve">التكييف:</w:t>
       </w:r>
       <w:r>
         <w:rPr>
@@ -772,7 +802,7 @@
         <w:rPr>
           <w:rtl/>
         </w:rPr>
-        <w:t xml:space="preserve">ما يُركب في المصنع وما يُترك للتركيب في الموقع.</w:t>
+        <w:t xml:space="preserve">تُمدَّد في المصنع أنابيب التكييف وتصريف المياه ونقاط الكهرباء الخاصة به، بحيث يُركَّب جهاز التكييف في الموقع بكل سهولة.</w:t>
       </w:r>
     </w:p>
     <w:p>
@@ -790,7 +820,7 @@
           <w:bCs/>
           <w:b/>
         </w:rPr>
-        <w:t xml:space="preserve">مستوى التجهيز:</w:t>
+        <w:t xml:space="preserve">التهوية والسباكة:</w:t>
       </w:r>
       <w:r>
         <w:rPr>
@@ -802,7 +832,7 @@
         <w:rPr>
           <w:rtl/>
         </w:rPr>
-        <w:t xml:space="preserve">نرجو تسعير كل نموذج حسب مستويات التجهيز الواردة في دراستكم (هيكل مع غلاف، جاهز من الخارج، نصف تشطيب، جاهز للسكن، فاخر).</w:t>
+        <w:t xml:space="preserve">ما يُركب في المصنع وما يُترك للتركيب في الموقع.</w:t>
       </w:r>
     </w:p>
     <w:p>
@@ -820,7 +850,7 @@
           <w:bCs/>
           <w:b/>
         </w:rPr>
-        <w:t xml:space="preserve">السلامة والتحمل:</w:t>
+        <w:t xml:space="preserve">مستوى التجهيز:</w:t>
       </w:r>
       <w:r>
         <w:rPr>
@@ -832,7 +862,7 @@
         <w:rPr>
           <w:rtl/>
         </w:rPr>
-        <w:t xml:space="preserve">مقاومة الحريق، وتحمل الرياح والغبار والرطوبة.</w:t>
+        <w:t xml:space="preserve">نرجو تسعير كل نموذج حسب مستويات التجهيز الواردة في دراستكم (هيكل مع غلاف، جاهز من الخارج، نصف تشطيب، جاهز للسكن، فاخر).</w:t>
       </w:r>
     </w:p>
     <w:p>
@@ -850,7 +880,7 @@
           <w:bCs/>
           <w:b/>
         </w:rPr>
-        <w:t xml:space="preserve">النقل والتركيب:</w:t>
+        <w:t xml:space="preserve">السلامة والتحمل:</w:t>
       </w:r>
       <w:r>
         <w:rPr>
@@ -862,7 +892,7 @@
         <w:rPr>
           <w:rtl/>
         </w:rPr>
-        <w:t xml:space="preserve">الأبعاد والوزن أثناء النقل، وعدد الوحدات في الحاوية، ومتطلبات الأساسات، ودليل التركيب.</w:t>
+        <w:t xml:space="preserve">مقاومة الحريق، وتحمل الرياح والغبار والرطوبة.</w:t>
       </w:r>
     </w:p>
     <w:p>
@@ -880,7 +910,7 @@
           <w:bCs/>
           <w:b/>
         </w:rPr>
-        <w:t xml:space="preserve">الضمان والصيانة:</w:t>
+        <w:t xml:space="preserve">النقل والتركيب:</w:t>
       </w:r>
       <w:r>
         <w:rPr>
@@ -892,168 +922,16 @@
         <w:rPr>
           <w:rtl/>
         </w:rPr>
-        <w:t xml:space="preserve">مدة الضمان لكل جزء، وتوفر قطع الغيار، وإمكانية تدريب فريقنا على التركيب.</w:t>
-      </w:r>
-    </w:p>
-    <w:bookmarkEnd w:id="23"/>
-    <w:bookmarkStart w:id="24" w:name="X276539f8c37fef896d5ab9edbdb047b2a976725"/>
-    <w:p>
-      <w:pPr>
-        <w:pStyle w:val="Heading2"/>
-        <w:bidi/>
-      </w:pPr>
-      <w:r>
-        <w:rPr>
-          <w:rtl/>
-        </w:rPr>
-        <w:t xml:space="preserve">خامساً: المستندات والمعلومات التجارية المطلوبة</w:t>
-      </w:r>
-    </w:p>
-    <w:p>
-      <w:pPr>
-        <w:numPr>
-          <w:ilvl w:val="0"/>
-          <w:numId w:val="1004"/>
-        </w:numPr>
-        <w:pStyle w:val="Compact"/>
-        <w:bidi/>
-      </w:pPr>
-      <w:r>
-        <w:rPr>
-          <w:rtl/>
-        </w:rPr>
-        <w:t xml:space="preserve">أسماء المصانع التي سيتم التوريد منها، وبلد المنشأ الفعلي لكل منتج.</w:t>
-      </w:r>
-    </w:p>
-    <w:p>
-      <w:pPr>
-        <w:numPr>
-          <w:ilvl w:val="0"/>
-          <w:numId w:val="1004"/>
-        </w:numPr>
-        <w:pStyle w:val="Compact"/>
-        <w:bidi/>
-      </w:pPr>
-      <w:r>
-        <w:rPr>
-          <w:rtl/>
-        </w:rPr>
-        <w:t xml:space="preserve">شهادات الجودة والمطابقة المتوفرة، وشهادات المنشأ، لأن دخول المنتجات للمملكة يتطلب إجراءات المطابقة السعودية.</w:t>
-      </w:r>
-    </w:p>
-    <w:p>
-      <w:pPr>
-        <w:numPr>
-          <w:ilvl w:val="0"/>
-          <w:numId w:val="1004"/>
-        </w:numPr>
-        <w:pStyle w:val="Compact"/>
-        <w:bidi/>
-      </w:pPr>
-      <w:r>
-        <w:rPr>
-          <w:rtl/>
-        </w:rPr>
-        <w:t xml:space="preserve">قائمة أسعار لكل نموذج ومستوى تجهيز، بسعر المصنع وسعر التوصيل إلى ميناء جدة أو الدمام.</w:t>
-      </w:r>
-    </w:p>
-    <w:p>
-      <w:pPr>
-        <w:numPr>
-          <w:ilvl w:val="0"/>
-          <w:numId w:val="1004"/>
-        </w:numPr>
-        <w:pStyle w:val="Compact"/>
-        <w:bidi/>
-      </w:pPr>
-      <w:r>
-        <w:rPr>
-          <w:rtl/>
-        </w:rPr>
-        <w:t xml:space="preserve">الحد الأدنى للطلب، ومدة التصنيع والتوريد.</w:t>
-      </w:r>
-    </w:p>
-    <w:p>
-      <w:pPr>
-        <w:numPr>
-          <w:ilvl w:val="0"/>
-          <w:numId w:val="1004"/>
-        </w:numPr>
-        <w:pStyle w:val="Compact"/>
-        <w:bidi/>
-      </w:pPr>
-      <w:r>
-        <w:rPr>
-          <w:rtl/>
-        </w:rPr>
-        <w:t xml:space="preserve">شروط الدفع، وتفاصيل التمويل الذي أشرتم إليه، والضمانات المطلوبة من الطرفين.</w:t>
-      </w:r>
-    </w:p>
-    <w:p>
-      <w:pPr>
-        <w:numPr>
-          <w:ilvl w:val="0"/>
-          <w:numId w:val="1004"/>
-        </w:numPr>
-        <w:pStyle w:val="Compact"/>
-        <w:bidi/>
-      </w:pPr>
-      <w:r>
-        <w:rPr>
-          <w:rtl/>
-        </w:rPr>
-        <w:t xml:space="preserve">مسودة اتفاقية الوكالة.</w:t>
-      </w:r>
-    </w:p>
-    <w:bookmarkEnd w:id="24"/>
-    <w:bookmarkStart w:id="25" w:name="سادساً-الخطوة-التالية"/>
-    <w:p>
-      <w:pPr>
-        <w:pStyle w:val="Heading2"/>
-        <w:bidi/>
-      </w:pPr>
-      <w:r>
-        <w:rPr>
-          <w:rtl/>
-        </w:rPr>
-        <w:t xml:space="preserve">سادساً: الخطوة التالية</w:t>
-      </w:r>
-    </w:p>
-    <w:p>
-      <w:pPr>
-        <w:bidi/>
-      </w:pPr>
-      <w:r>
-        <w:rPr>
-          <w:rtl/>
-        </w:rPr>
-        <w:t xml:space="preserve">بعد استلام الكتالوجات والمواصفات والأسعار، نحدد لكم النماذج والأشكال والمواصفات النهائية، ثم نتفق على شحنة العينات وتوقيع اتفاقية الوكالة.</w:t>
-      </w:r>
-    </w:p>
-    <w:p>
-      <w:pPr>
-        <w:bidi/>
-      </w:pPr>
-      <w:r>
-        <w:rPr>
-          <w:rtl/>
-        </w:rPr>
-        <w:t xml:space="preserve">نتطلع إلى ردكم، ولكم منا فائق الاحترام والتقدير.</w:t>
-      </w:r>
-    </w:p>
-    <w:p>
-      <w:pPr>
-        <w:bidi/>
-      </w:pPr>
-      <w:r>
-        <w:rPr>
-          <w:rtl/>
-        </w:rPr>
-        <w:t xml:space="preserve"> </w:t>
-      </w:r>
-    </w:p>
-    <w:p>
-      <w:pPr>
+        <w:t xml:space="preserve">الأبعاد والوزن أثناء النقل، وعدد الوحدات في الحاوية، ومتطلبات الأساسات، ودليل التركيب.</w:t>
+      </w:r>
+    </w:p>
+    <w:p>
+      <w:pPr>
+        <w:numPr>
+          <w:ilvl w:val="0"/>
+          <w:numId w:val="1003"/>
+        </w:numPr>
+        <w:pStyle w:val="Compact"/>
         <w:bidi/>
       </w:pPr>
       <w:r>
@@ -1062,7 +940,7 @@
           <w:bCs/>
           <w:b/>
         </w:rPr>
-        <w:t xml:space="preserve">الاسم:</w:t>
+        <w:t xml:space="preserve">الضمان والصيانة:</w:t>
       </w:r>
       <w:r>
         <w:rPr>
@@ -1074,11 +952,41 @@
         <w:rPr>
           <w:rtl/>
         </w:rPr>
-        <w:t xml:space="preserve">______________________</w:t>
-      </w:r>
-    </w:p>
-    <w:p>
-      <w:pPr>
+        <w:t xml:space="preserve">مدة الضمان لكل جزء، وتوفر قطع الغيار، وإمكانية تدريب فريقنا على التركيب.</w:t>
+      </w:r>
+    </w:p>
+    <w:bookmarkEnd w:id="23"/>
+    <w:bookmarkStart w:id="24" w:name="خامساً-مدة-وصول-الطلب-والطاقة-الإنتاجية"/>
+    <w:p>
+      <w:pPr>
+        <w:pStyle w:val="Heading2"/>
+        <w:bidi/>
+      </w:pPr>
+      <w:r>
+        <w:rPr>
+          <w:rtl/>
+        </w:rPr>
+        <w:t xml:space="preserve">خامساً: مدة وصول الطلب والطاقة الإنتاجية</w:t>
+      </w:r>
+    </w:p>
+    <w:p>
+      <w:pPr>
+        <w:bidi/>
+      </w:pPr>
+      <w:r>
+        <w:rPr>
+          <w:rtl/>
+        </w:rPr>
+        <w:t xml:space="preserve">هذان البندان أساسيان عندنا في الاختيار، ونرجو الإجابة عنهما بدقة لكل مصنع ولكل نموذج:</w:t>
+      </w:r>
+    </w:p>
+    <w:p>
+      <w:pPr>
+        <w:numPr>
+          <w:ilvl w:val="0"/>
+          <w:numId w:val="1004"/>
+        </w:numPr>
+        <w:pStyle w:val="Compact"/>
         <w:bidi/>
       </w:pPr>
       <w:r>
@@ -1087,7 +995,7 @@
           <w:bCs/>
           <w:b/>
         </w:rPr>
-        <w:t xml:space="preserve">الصفة:</w:t>
+        <w:t xml:space="preserve">مدة وصول الطلب:</w:t>
       </w:r>
       <w:r>
         <w:rPr>
@@ -1099,11 +1007,16 @@
         <w:rPr>
           <w:rtl/>
         </w:rPr>
-        <w:t xml:space="preserve">______________________</w:t>
-      </w:r>
-    </w:p>
-    <w:p>
-      <w:pPr>
+        <w:t xml:space="preserve">المدة الكاملة من تأكيد الطلب حتى وصوله إلى ميناء جدة أو الدمام، مقسمة إلى مدة التصنيع ومدة الشحن، وذلك للعينات وللطلبات التجارية.</w:t>
+      </w:r>
+    </w:p>
+    <w:p>
+      <w:pPr>
+        <w:numPr>
+          <w:ilvl w:val="0"/>
+          <w:numId w:val="1004"/>
+        </w:numPr>
+        <w:pStyle w:val="Compact"/>
         <w:bidi/>
       </w:pPr>
       <w:r>
@@ -1112,7 +1025,7 @@
           <w:bCs/>
           <w:b/>
         </w:rPr>
-        <w:t xml:space="preserve">المؤسسة:</w:t>
+        <w:t xml:space="preserve">الطاقة الإنتاجية:</w:t>
       </w:r>
       <w:r>
         <w:rPr>
@@ -1124,35 +1037,124 @@
         <w:rPr>
           <w:rtl/>
         </w:rPr>
-        <w:t xml:space="preserve">______________________</w:t>
-      </w:r>
-    </w:p>
-    <w:p>
-      <w:pPr>
-        <w:bidi/>
-      </w:pPr>
-      <w:r>
-        <w:rPr>
-          <w:rtl/>
-          <w:bCs/>
-          <w:b/>
-        </w:rPr>
-        <w:t xml:space="preserve">التوقيع والختم:</w:t>
-      </w:r>
-      <w:r>
-        <w:rPr>
-          <w:rtl/>
-        </w:rPr>
-        <w:t xml:space="preserve"> </w:t>
-      </w:r>
-      <w:r>
-        <w:rPr>
-          <w:rtl/>
-        </w:rPr>
-        <w:t xml:space="preserve">______________________</w:t>
+        <w:t xml:space="preserve">قدرة كل مصنع على تلبية الطلب من كل نموذج، أي عدد الوحدات التي يستطيع إنتاجها شهرياً، وأكبر طلب يستطيع تنفيذه دفعة واحدة.</w:t>
+      </w:r>
+    </w:p>
+    <w:bookmarkEnd w:id="24"/>
+    <w:bookmarkStart w:id="25" w:name="X24088c856cf357882496c34ac25964a75010f6a"/>
+    <w:p>
+      <w:pPr>
+        <w:pStyle w:val="Heading2"/>
+        <w:bidi/>
+      </w:pPr>
+      <w:r>
+        <w:rPr>
+          <w:rtl/>
+        </w:rPr>
+        <w:t xml:space="preserve">سادساً: المستندات والمعلومات التجارية المطلوبة</w:t>
+      </w:r>
+    </w:p>
+    <w:p>
+      <w:pPr>
+        <w:numPr>
+          <w:ilvl w:val="0"/>
+          <w:numId w:val="1005"/>
+        </w:numPr>
+        <w:pStyle w:val="Compact"/>
+        <w:bidi/>
+      </w:pPr>
+      <w:r>
+        <w:rPr>
+          <w:rtl/>
+        </w:rPr>
+        <w:t xml:space="preserve">أسماء المصانع التي سيتم التوريد منها، وبلد المنشأ الفعلي لكل منتج.</w:t>
+      </w:r>
+    </w:p>
+    <w:p>
+      <w:pPr>
+        <w:numPr>
+          <w:ilvl w:val="0"/>
+          <w:numId w:val="1005"/>
+        </w:numPr>
+        <w:pStyle w:val="Compact"/>
+        <w:bidi/>
+      </w:pPr>
+      <w:r>
+        <w:rPr>
+          <w:rtl/>
+        </w:rPr>
+        <w:t xml:space="preserve">شهادات الجودة والمطابقة المتوفرة، وشهادات المنشأ، لأن دخول المنتجات للمملكة يتطلب إجراءات المطابقة السعودية.</w:t>
+      </w:r>
+    </w:p>
+    <w:p>
+      <w:pPr>
+        <w:numPr>
+          <w:ilvl w:val="0"/>
+          <w:numId w:val="1005"/>
+        </w:numPr>
+        <w:pStyle w:val="Compact"/>
+        <w:bidi/>
+      </w:pPr>
+      <w:r>
+        <w:rPr>
+          <w:rtl/>
+        </w:rPr>
+        <w:t xml:space="preserve">قائمة أسعار لكل نموذج ومستوى تجهيز، بسعر المصنع وسعر التوصيل إلى ميناء جدة أو الدمام.</w:t>
+      </w:r>
+    </w:p>
+    <w:p>
+      <w:pPr>
+        <w:numPr>
+          <w:ilvl w:val="0"/>
+          <w:numId w:val="1005"/>
+        </w:numPr>
+        <w:pStyle w:val="Compact"/>
+        <w:bidi/>
+      </w:pPr>
+      <w:r>
+        <w:rPr>
+          <w:rtl/>
+        </w:rPr>
+        <w:t xml:space="preserve">الحد الأدنى للطلب.</w:t>
       </w:r>
     </w:p>
     <w:bookmarkEnd w:id="25"/>
+    <w:bookmarkStart w:id="26" w:name="سابعاً-الخطوة-التالية"/>
+    <w:p>
+      <w:pPr>
+        <w:pStyle w:val="Heading2"/>
+        <w:bidi/>
+      </w:pPr>
+      <w:r>
+        <w:rPr>
+          <w:rtl/>
+        </w:rPr>
+        <w:t xml:space="preserve">سابعاً: الخطوة التالية</w:t>
+      </w:r>
+    </w:p>
+    <w:p>
+      <w:pPr>
+        <w:bidi/>
+      </w:pPr>
+      <w:r>
+        <w:rPr>
+          <w:rtl/>
+        </w:rPr>
+        <w:t xml:space="preserve">بعد استلام الأشكال والنماذج والمواصفات والأسعار، نختار منها ما يناسبنا ونحدد لكم المواصفات النهائية، ثم نتفق على شحنة العينات والتعاقد.</w:t>
+      </w:r>
+    </w:p>
+    <w:p>
+      <w:pPr>
+        <w:bidi/>
+      </w:pPr>
+      <w:r>
+        <w:rPr>
+          <w:rtl/>
+        </w:rPr>
+        <w:t xml:space="preserve">نتطلع إلى ردكم، ولكم منا فائق الاحترام والتقدير.</w:t>
+      </w:r>
+    </w:p>
+    <w:bookmarkEnd w:id="26"/>
     <w:sectPr/>
   </w:body>
 </w:document>
@@ -1438,6 +1440,36 @@
     </w:lvlOverride>
   </w:num>
   <w:num w:numId="1004">
+    <w:abstractNumId w:val="99411"/>
+    <w:lvlOverride w:ilvl="0">
+      <w:startOverride w:val="1"/>
+    </w:lvlOverride>
+    <w:lvlOverride w:ilvl="1">
+      <w:startOverride w:val="1"/>
+    </w:lvlOverride>
+    <w:lvlOverride w:ilvl="2">
+      <w:startOverride w:val="1"/>
+    </w:lvlOverride>
+    <w:lvlOverride w:ilvl="3">
+      <w:startOverride w:val="1"/>
+    </w:lvlOverride>
+    <w:lvlOverride w:ilvl="4">
+      <w:startOverride w:val="1"/>
+    </w:lvlOverride>
+    <w:lvlOverride w:ilvl="5">
+      <w:startOverride w:val="1"/>
+    </w:lvlOverride>
+    <w:lvlOverride w:ilvl="6">
+      <w:startOverride w:val="1"/>
+    </w:lvlOverride>
+    <w:lvlOverride w:ilvl="7">
+      <w:startOverride w:val="1"/>
+    </w:lvlOverride>
+    <w:lvlOverride w:ilvl="8">
+      <w:startOverride w:val="1"/>
+    </w:lvlOverride>
+  </w:num>
+  <w:num w:numId="1005">
     <w:abstractNumId w:val="99411"/>
     <w:lvlOverride w:ilvl="0">
       <w:startOverride w:val="1"/>

</xml_diff>

<commit_message>
Readdress RABC reply to Dr. Mona Al-Ghanem on Watad letterhead; add order-flow and lead-time commitments
Co-Authored-By: Claude Opus 5.5 <noreply@anthropic.com>
Claude-Session: https://claude.ai/code/session_01Ni3wtRpXsBaaw8voUTrb9J
</commit_message>
<xml_diff>
--- a/reports/رد على خطاب RABC.docx
+++ b/reports/رد على خطاب RABC.docx
@@ -49,7 +49,7 @@
         <w:rPr>
           <w:rtl/>
         </w:rPr>
-        <w:t xml:space="preserve">سعادة د. رائد الحلبي، رئيس مجلس الإدارة، RABC، موسكو</w:t>
+        <w:t xml:space="preserve">سعادة د. منى الغانم المحترمة</w:t>
       </w:r>
     </w:p>
     <w:p>
@@ -74,7 +74,7 @@
         <w:rPr>
           <w:rtl/>
         </w:rPr>
-        <w:t xml:space="preserve">رد على خطابكم رقم 1377/2025 بتاريخ 26-10-2026: طلب وكالة رسمية وعينات للبيوت الجاهزة والكبسولات</w:t>
+        <w:t xml:space="preserve">رد على الخطاب رقم 1377/2025 بتاريخ 26-10-2026: طلب وكالة رسمية وعينات للبيوت الجاهزة والكبسولات</w:t>
       </w:r>
     </w:p>
     <w:p>
@@ -99,7 +99,7 @@
         <w:t xml:space="preserve">نشكركم على خطابكم وعلى الدراسة المرفقة حول أنواع الأبنية الجاهزة في روسيا الاتحادية. ونفيدكم بتصورنا للتعاون، وبالمعلومات التي طلبتموها، على النحو التالي.</w:t>
       </w:r>
     </w:p>
-    <w:bookmarkStart w:id="20" w:name="أولاً-طبيعة-التعاون-المطلوب"/>
+    <w:bookmarkStart w:id="20" w:name="أولاً-طبيعة-عملنا-وما-نبحث-عنه"/>
     <w:p>
       <w:pPr>
         <w:pStyle w:val="Heading2"/>
@@ -109,7 +109,43 @@
         <w:rPr>
           <w:rtl/>
         </w:rPr>
-        <w:t xml:space="preserve">أولاً: طبيعة التعاون المطلوب</w:t>
+        <w:t xml:space="preserve">أولاً: طبيعة عملنا وما نبحث عنه</w:t>
+      </w:r>
+    </w:p>
+    <w:p>
+      <w:pPr>
+        <w:bidi/>
+      </w:pPr>
+      <w:r>
+        <w:rPr>
+          <w:rtl/>
+        </w:rPr>
+        <w:t xml:space="preserve">لدينا حجم طلبات عالٍ ومتكرر يومياً وشهرياً على البيوت الجاهزة والكبسولات، ونرغب في نقل عمليات التصنيع والتنفيذ إلى مصنع في الخارج، لنركز نحن على البيع والتسويق في المملكة العربية السعودية ودول الخليج.</w:t>
+      </w:r>
+    </w:p>
+    <w:p>
+      <w:pPr>
+        <w:bidi/>
+      </w:pPr>
+      <w:r>
+        <w:rPr>
+          <w:rtl/>
+        </w:rPr>
+        <w:t xml:space="preserve">ولذلك نرغب في الحصول على وكالة رسمية لمنتجات المصانع التي تمثلونها في المملكة ودول الخليج، على أن ترسلوا لنا جميع الأشكال والنماذج المتوفرة، ونختار منها ما يناسب أسواقنا.</w:t>
+      </w:r>
+    </w:p>
+    <w:bookmarkEnd w:id="20"/>
+    <w:bookmarkStart w:id="21" w:name="ثانياً-آلية-العمل-المقترحة"/>
+    <w:p>
+      <w:pPr>
+        <w:pStyle w:val="Heading2"/>
+        <w:bidi/>
+      </w:pPr>
+      <w:r>
+        <w:rPr>
+          <w:rtl/>
+        </w:rPr>
+        <w:t xml:space="preserve">ثانياً: آلية العمل المقترحة</w:t>
       </w:r>
     </w:p>
     <w:p>
@@ -127,7 +163,7 @@
           <w:bCs/>
           <w:b/>
         </w:rPr>
-        <w:t xml:space="preserve">وكالة رسمية:</w:t>
+        <w:t xml:space="preserve">النماذج والعينات:</w:t>
       </w:r>
       <w:r>
         <w:rPr>
@@ -139,7 +175,7 @@
         <w:rPr>
           <w:rtl/>
         </w:rPr>
-        <w:t xml:space="preserve">نرغب في الحصول على وكالة رسمية لمنتجات المصانع التي تمثلونها في المملكة العربية السعودية. وآلية العمل التي نقترحها أن ترسلوا لنا جميع الأشكال والنماذج المتوفرة، ونختار منها ما يناسب السوق السعودي.</w:t>
+        <w:t xml:space="preserve">نختار النماذج من المصنع، ونستلم عينات من أغلبها في المملكة لعرضها على العملاء.</w:t>
       </w:r>
     </w:p>
     <w:p>
@@ -157,7 +193,7 @@
           <w:bCs/>
           <w:b/>
         </w:rPr>
-        <w:t xml:space="preserve">العينات:</w:t>
+        <w:t xml:space="preserve">مدة توريد ثابتة لكل نموذج:</w:t>
       </w:r>
       <w:r>
         <w:rPr>
@@ -169,7 +205,7 @@
         <w:rPr>
           <w:rtl/>
         </w:rPr>
-        <w:t xml:space="preserve">نطلب إرسال عينات من أغلب المنتجات المختارة إلى المملكة لعرضها على العملاء واختبارها في الظروف المناخية المحلية.</w:t>
+        <w:t xml:space="preserve">نتفق مسبقاً على مدة التوريد لكل نموذج، مثلاً 40 يوم عمل حتى الوصول، ونسوق للعملاء على أساسها.</w:t>
       </w:r>
     </w:p>
     <w:p>
@@ -187,7 +223,7 @@
           <w:bCs/>
           <w:b/>
         </w:rPr>
-        <w:t xml:space="preserve">مسؤولية البيع:</w:t>
+        <w:t xml:space="preserve">الطلب فور التعاقد مع العميل:</w:t>
       </w:r>
       <w:r>
         <w:rPr>
@@ -199,7 +235,7 @@
         <w:rPr>
           <w:rtl/>
         </w:rPr>
-        <w:t xml:space="preserve">نتولى نحن التسويق والبيع للعملاء داخل المملكة، والتنسيق مع العملاء بعد البيع.</w:t>
+        <w:t xml:space="preserve">عند موافقة العميل وتوقيعه معنا، نبلغ المصنع فوراً بالنموذج المطلوب، مثلاً النموذج رقم 2، ليبدأ تصنيعه وشحنه.</w:t>
       </w:r>
     </w:p>
     <w:p>
@@ -232,8 +268,49 @@
         <w:t xml:space="preserve">يكون الدفع بعد التعاقد.</w:t>
       </w:r>
     </w:p>
-    <w:bookmarkEnd w:id="20"/>
-    <w:bookmarkStart w:id="21" w:name="ثانياً-المنتجات-المطلوبة"/>
+    <w:p>
+      <w:pPr>
+        <w:numPr>
+          <w:ilvl w:val="0"/>
+          <w:numId w:val="1001"/>
+        </w:numPr>
+        <w:pStyle w:val="Compact"/>
+        <w:bidi/>
+      </w:pPr>
+      <w:r>
+        <w:rPr>
+          <w:rtl/>
+          <w:bCs/>
+          <w:b/>
+        </w:rPr>
+        <w:t xml:space="preserve">مسؤولية البيع:</w:t>
+      </w:r>
+      <w:r>
+        <w:rPr>
+          <w:rtl/>
+        </w:rPr>
+        <w:t xml:space="preserve"> </w:t>
+      </w:r>
+      <w:r>
+        <w:rPr>
+          <w:rtl/>
+        </w:rPr>
+        <w:t xml:space="preserve">نتولى نحن التسويق والبيع للعملاء، والتنسيق معهم بعد البيع.</w:t>
+      </w:r>
+    </w:p>
+    <w:p>
+      <w:pPr>
+        <w:bidi/>
+      </w:pPr>
+      <w:r>
+        <w:rPr>
+          <w:rtl/>
+        </w:rPr>
+        <w:t xml:space="preserve">ويجب أن يكون المصنع على علم تام بهذه الآلية، لأن الطلبات تصله بحسب المبيعات وبأعداد متفاوتة؛ فقد نرسل في يوم أربعة طلبات، وفي اليوم التالي طلباً واحداً، وبعده سبعة طلبات.</w:t>
+      </w:r>
+    </w:p>
+    <w:bookmarkEnd w:id="21"/>
+    <w:bookmarkStart w:id="22" w:name="X9c66b1d4355132f7d47527f4bec00d8cd3998ff"/>
     <w:p>
       <w:pPr>
         <w:pStyle w:val="Heading2"/>
@@ -243,18 +320,18 @@
         <w:rPr>
           <w:rtl/>
         </w:rPr>
-        <w:t xml:space="preserve">ثانياً: المنتجات المطلوبة</w:t>
-      </w:r>
-    </w:p>
-    <w:p>
-      <w:pPr>
-        <w:bidi/>
-      </w:pPr>
-      <w:r>
-        <w:rPr>
-          <w:rtl/>
-        </w:rPr>
-        <w:t xml:space="preserve">نرجو إرسال كتالوجات ونماذج لجميع ما يتوفر لديكم من المنتجات التالية، ونحن نحدد لكم بعدها الأشكال والمواصفات المختارة:</w:t>
+        <w:t xml:space="preserve">ثالثاً: الالتزام بمدة التوريد والطاقة الإنتاجية</w:t>
+      </w:r>
+    </w:p>
+    <w:p>
+      <w:pPr>
+        <w:bidi/>
+      </w:pPr>
+      <w:r>
+        <w:rPr>
+          <w:rtl/>
+        </w:rPr>
+        <w:t xml:space="preserve">الالتزام بمدة التوريد شرط أساسي عندنا، لأن مصداقيتنا مع العميل مبنية على تسليمه في الموعد الذي وعدناه به. لذلك نرجو الإجابة بدقة عما يلي، لكل مصنع ولكل نموذج:</w:t>
       </w:r>
     </w:p>
     <w:p>
@@ -269,6 +346,121 @@
       <w:r>
         <w:rPr>
           <w:rtl/>
+          <w:bCs/>
+          <w:b/>
+        </w:rPr>
+        <w:t xml:space="preserve">مدة وصول الطلب:</w:t>
+      </w:r>
+      <w:r>
+        <w:rPr>
+          <w:rtl/>
+        </w:rPr>
+        <w:t xml:space="preserve"> </w:t>
+      </w:r>
+      <w:r>
+        <w:rPr>
+          <w:rtl/>
+        </w:rPr>
+        <w:t xml:space="preserve">المدة الكاملة من استلام الطلب حتى وصوله إلى ميناء جدة أو الدمام، مقسمة إلى مدة التصنيع ومدة الشحن، وذلك للعينات وللطلبات التجارية.</w:t>
+      </w:r>
+    </w:p>
+    <w:p>
+      <w:pPr>
+        <w:numPr>
+          <w:ilvl w:val="0"/>
+          <w:numId w:val="1002"/>
+        </w:numPr>
+        <w:pStyle w:val="Compact"/>
+        <w:bidi/>
+      </w:pPr>
+      <w:r>
+        <w:rPr>
+          <w:rtl/>
+          <w:bCs/>
+          <w:b/>
+        </w:rPr>
+        <w:t xml:space="preserve">الطاقة الإنتاجية:</w:t>
+      </w:r>
+      <w:r>
+        <w:rPr>
+          <w:rtl/>
+        </w:rPr>
+        <w:t xml:space="preserve"> </w:t>
+      </w:r>
+      <w:r>
+        <w:rPr>
+          <w:rtl/>
+        </w:rPr>
+        <w:t xml:space="preserve">عدد الوحدات التي يستطيع المصنع إنتاجها شهرياً من كل نموذج، وأكبر عدد من الطلبات يستطيع استقباله في يوم واحد مع الالتزام بالمدة نفسها.</w:t>
+      </w:r>
+    </w:p>
+    <w:p>
+      <w:pPr>
+        <w:numPr>
+          <w:ilvl w:val="0"/>
+          <w:numId w:val="1002"/>
+        </w:numPr>
+        <w:pStyle w:val="Compact"/>
+        <w:bidi/>
+      </w:pPr>
+      <w:r>
+        <w:rPr>
+          <w:rtl/>
+          <w:bCs/>
+          <w:b/>
+        </w:rPr>
+        <w:t xml:space="preserve">ضمان الالتزام:</w:t>
+      </w:r>
+      <w:r>
+        <w:rPr>
+          <w:rtl/>
+        </w:rPr>
+        <w:t xml:space="preserve"> </w:t>
+      </w:r>
+      <w:r>
+        <w:rPr>
+          <w:rtl/>
+        </w:rPr>
+        <w:t xml:space="preserve">كيف يضمن المصنع الالتزام بمدة التوريد المتفق عليها لكل طلب.</w:t>
+      </w:r>
+    </w:p>
+    <w:bookmarkEnd w:id="22"/>
+    <w:bookmarkStart w:id="23" w:name="رابعاً-المنتجات-المطلوبة"/>
+    <w:p>
+      <w:pPr>
+        <w:pStyle w:val="Heading2"/>
+        <w:bidi/>
+      </w:pPr>
+      <w:r>
+        <w:rPr>
+          <w:rtl/>
+        </w:rPr>
+        <w:t xml:space="preserve">رابعاً: المنتجات المطلوبة</w:t>
+      </w:r>
+    </w:p>
+    <w:p>
+      <w:pPr>
+        <w:bidi/>
+      </w:pPr>
+      <w:r>
+        <w:rPr>
+          <w:rtl/>
+        </w:rPr>
+        <w:t xml:space="preserve">نرجو إرسال كتالوجات ونماذج لجميع ما يتوفر لديكم من المنتجات التالية:</w:t>
+      </w:r>
+    </w:p>
+    <w:p>
+      <w:pPr>
+        <w:numPr>
+          <w:ilvl w:val="0"/>
+          <w:numId w:val="1003"/>
+        </w:numPr>
+        <w:pStyle w:val="Compact"/>
+        <w:bidi/>
+      </w:pPr>
+      <w:r>
+        <w:rPr>
+          <w:rtl/>
         </w:rPr>
         <w:t xml:space="preserve">الكبسولات السكنية (Space Capsule) بهيكل حديدي وغلاف معدني.</w:t>
       </w:r>
@@ -277,7 +469,7 @@
       <w:pPr>
         <w:numPr>
           <w:ilvl w:val="0"/>
-          <w:numId w:val="1002"/>
+          <w:numId w:val="1003"/>
         </w:numPr>
         <w:pStyle w:val="Compact"/>
         <w:bidi/>
@@ -293,7 +485,7 @@
       <w:pPr>
         <w:numPr>
           <w:ilvl w:val="0"/>
-          <w:numId w:val="1002"/>
+          <w:numId w:val="1003"/>
         </w:numPr>
         <w:pStyle w:val="Compact"/>
         <w:bidi/>
@@ -309,7 +501,7 @@
       <w:pPr>
         <w:numPr>
           <w:ilvl w:val="0"/>
-          <w:numId w:val="1002"/>
+          <w:numId w:val="1003"/>
         </w:numPr>
         <w:pStyle w:val="Compact"/>
         <w:bidi/>
@@ -325,7 +517,7 @@
       <w:pPr>
         <w:numPr>
           <w:ilvl w:val="0"/>
-          <w:numId w:val="1002"/>
+          <w:numId w:val="1003"/>
         </w:numPr>
         <w:pStyle w:val="Compact"/>
         <w:bidi/>
@@ -341,7 +533,7 @@
       <w:pPr>
         <w:numPr>
           <w:ilvl w:val="0"/>
-          <w:numId w:val="1002"/>
+          <w:numId w:val="1003"/>
         </w:numPr>
         <w:pStyle w:val="Compact"/>
         <w:bidi/>
@@ -353,8 +545,8 @@
         <w:t xml:space="preserve">أثاث الوحدات، مثل غرف النوم والطاولات، إن توفر لدى المصانع نفسها كباقة متكاملة مع الوحدة.</w:t>
       </w:r>
     </w:p>
-    <w:bookmarkEnd w:id="21"/>
-    <w:bookmarkStart w:id="22" w:name="ثالثاً-التوزيعات-المساحات-المطلوبة"/>
+    <w:bookmarkEnd w:id="23"/>
+    <w:bookmarkStart w:id="24" w:name="خامساً-التوزيعات-المساحات-المطلوبة"/>
     <w:p>
       <w:pPr>
         <w:pStyle w:val="Heading2"/>
@@ -364,7 +556,7 @@
         <w:rPr>
           <w:rtl/>
         </w:rPr>
-        <w:t xml:space="preserve">ثالثاً: التوزيعات (المساحات) المطلوبة</w:t>
+        <w:t xml:space="preserve">خامساً: التوزيعات (المساحات) المطلوبة</w:t>
       </w:r>
     </w:p>
     <w:p>
@@ -540,8 +732,8 @@
         <w:t xml:space="preserve">ونرجو إرسال جميع الأشكال المتوفرة لكل توزيع، مع المساحة الإجمالية والداخلية والأبعاد الخارجية لكل شكل.</w:t>
       </w:r>
     </w:p>
-    <w:bookmarkEnd w:id="22"/>
-    <w:bookmarkStart w:id="23" w:name="رابعاً-المواصفات"/>
+    <w:bookmarkEnd w:id="24"/>
+    <w:bookmarkStart w:id="25" w:name="سادساً-المواصفات"/>
     <w:p>
       <w:pPr>
         <w:pStyle w:val="Heading2"/>
@@ -551,7 +743,7 @@
         <w:rPr>
           <w:rtl/>
         </w:rPr>
-        <w:t xml:space="preserve">رابعاً: المواصفات</w:t>
+        <w:t xml:space="preserve">سادساً: المواصفات</w:t>
       </w:r>
     </w:p>
     <w:p>
@@ -569,7 +761,7 @@
       <w:pPr>
         <w:numPr>
           <w:ilvl w:val="0"/>
-          <w:numId w:val="1003"/>
+          <w:numId w:val="1004"/>
         </w:numPr>
         <w:pStyle w:val="Compact"/>
         <w:bidi/>
@@ -599,7 +791,7 @@
       <w:pPr>
         <w:numPr>
           <w:ilvl w:val="0"/>
-          <w:numId w:val="1003"/>
+          <w:numId w:val="1004"/>
         </w:numPr>
         <w:pStyle w:val="Compact"/>
         <w:bidi/>
@@ -629,7 +821,7 @@
       <w:pPr>
         <w:numPr>
           <w:ilvl w:val="0"/>
-          <w:numId w:val="1003"/>
+          <w:numId w:val="1004"/>
         </w:numPr>
         <w:pStyle w:val="Compact"/>
         <w:bidi/>
@@ -659,7 +851,7 @@
       <w:pPr>
         <w:numPr>
           <w:ilvl w:val="0"/>
-          <w:numId w:val="1003"/>
+          <w:numId w:val="1004"/>
         </w:numPr>
         <w:pStyle w:val="Compact"/>
         <w:bidi/>
@@ -689,7 +881,7 @@
       <w:pPr>
         <w:numPr>
           <w:ilvl w:val="0"/>
-          <w:numId w:val="1003"/>
+          <w:numId w:val="1004"/>
         </w:numPr>
         <w:pStyle w:val="Compact"/>
         <w:bidi/>
@@ -719,7 +911,7 @@
       <w:pPr>
         <w:numPr>
           <w:ilvl w:val="0"/>
-          <w:numId w:val="1003"/>
+          <w:numId w:val="1004"/>
         </w:numPr>
         <w:pStyle w:val="Compact"/>
         <w:bidi/>
@@ -749,7 +941,7 @@
       <w:pPr>
         <w:numPr>
           <w:ilvl w:val="0"/>
-          <w:numId w:val="1003"/>
+          <w:numId w:val="1004"/>
         </w:numPr>
         <w:pStyle w:val="Compact"/>
         <w:bidi/>
@@ -779,7 +971,7 @@
       <w:pPr>
         <w:numPr>
           <w:ilvl w:val="0"/>
-          <w:numId w:val="1003"/>
+          <w:numId w:val="1004"/>
         </w:numPr>
         <w:pStyle w:val="Compact"/>
         <w:bidi/>
@@ -809,7 +1001,7 @@
       <w:pPr>
         <w:numPr>
           <w:ilvl w:val="0"/>
-          <w:numId w:val="1003"/>
+          <w:numId w:val="1004"/>
         </w:numPr>
         <w:pStyle w:val="Compact"/>
         <w:bidi/>
@@ -839,7 +1031,7 @@
       <w:pPr>
         <w:numPr>
           <w:ilvl w:val="0"/>
-          <w:numId w:val="1003"/>
+          <w:numId w:val="1004"/>
         </w:numPr>
         <w:pStyle w:val="Compact"/>
         <w:bidi/>
@@ -869,7 +1061,7 @@
       <w:pPr>
         <w:numPr>
           <w:ilvl w:val="0"/>
-          <w:numId w:val="1003"/>
+          <w:numId w:val="1004"/>
         </w:numPr>
         <w:pStyle w:val="Compact"/>
         <w:bidi/>
@@ -899,7 +1091,7 @@
       <w:pPr>
         <w:numPr>
           <w:ilvl w:val="0"/>
-          <w:numId w:val="1003"/>
+          <w:numId w:val="1004"/>
         </w:numPr>
         <w:pStyle w:val="Compact"/>
         <w:bidi/>
@@ -929,7 +1121,7 @@
       <w:pPr>
         <w:numPr>
           <w:ilvl w:val="0"/>
-          <w:numId w:val="1003"/>
+          <w:numId w:val="1004"/>
         </w:numPr>
         <w:pStyle w:val="Compact"/>
         <w:bidi/>
@@ -955,8 +1147,8 @@
         <w:t xml:space="preserve">مدة الضمان لكل جزء، وتوفر قطع الغيار، وإمكانية تدريب فريقنا على التركيب.</w:t>
       </w:r>
     </w:p>
-    <w:bookmarkEnd w:id="23"/>
-    <w:bookmarkStart w:id="24" w:name="خامساً-مدة-وصول-الطلب-والطاقة-الإنتاجية"/>
+    <w:bookmarkEnd w:id="25"/>
+    <w:bookmarkStart w:id="26" w:name="X33640480731a1360c99d67718f53e69685151db"/>
     <w:p>
       <w:pPr>
         <w:pStyle w:val="Heading2"/>
@@ -966,82 +1158,75 @@
         <w:rPr>
           <w:rtl/>
         </w:rPr>
-        <w:t xml:space="preserve">خامساً: مدة وصول الطلب والطاقة الإنتاجية</w:t>
-      </w:r>
-    </w:p>
-    <w:p>
-      <w:pPr>
-        <w:bidi/>
-      </w:pPr>
-      <w:r>
-        <w:rPr>
-          <w:rtl/>
-        </w:rPr>
-        <w:t xml:space="preserve">هذان البندان أساسيان عندنا في الاختيار، ونرجو الإجابة عنهما بدقة لكل مصنع ولكل نموذج:</w:t>
-      </w:r>
-    </w:p>
-    <w:p>
-      <w:pPr>
-        <w:numPr>
-          <w:ilvl w:val="0"/>
-          <w:numId w:val="1004"/>
-        </w:numPr>
-        <w:pStyle w:val="Compact"/>
-        <w:bidi/>
-      </w:pPr>
-      <w:r>
-        <w:rPr>
-          <w:rtl/>
-          <w:bCs/>
-          <w:b/>
-        </w:rPr>
-        <w:t xml:space="preserve">مدة وصول الطلب:</w:t>
-      </w:r>
-      <w:r>
-        <w:rPr>
-          <w:rtl/>
-        </w:rPr>
-        <w:t xml:space="preserve"> </w:t>
-      </w:r>
-      <w:r>
-        <w:rPr>
-          <w:rtl/>
-        </w:rPr>
-        <w:t xml:space="preserve">المدة الكاملة من تأكيد الطلب حتى وصوله إلى ميناء جدة أو الدمام، مقسمة إلى مدة التصنيع ومدة الشحن، وذلك للعينات وللطلبات التجارية.</w:t>
-      </w:r>
-    </w:p>
-    <w:p>
-      <w:pPr>
-        <w:numPr>
-          <w:ilvl w:val="0"/>
-          <w:numId w:val="1004"/>
-        </w:numPr>
-        <w:pStyle w:val="Compact"/>
-        <w:bidi/>
-      </w:pPr>
-      <w:r>
-        <w:rPr>
-          <w:rtl/>
-          <w:bCs/>
-          <w:b/>
-        </w:rPr>
-        <w:t xml:space="preserve">الطاقة الإنتاجية:</w:t>
-      </w:r>
-      <w:r>
-        <w:rPr>
-          <w:rtl/>
-        </w:rPr>
-        <w:t xml:space="preserve"> </w:t>
-      </w:r>
-      <w:r>
-        <w:rPr>
-          <w:rtl/>
-        </w:rPr>
-        <w:t xml:space="preserve">قدرة كل مصنع على تلبية الطلب من كل نموذج، أي عدد الوحدات التي يستطيع إنتاجها شهرياً، وأكبر طلب يستطيع تنفيذه دفعة واحدة.</w:t>
-      </w:r>
-    </w:p>
-    <w:bookmarkEnd w:id="24"/>
-    <w:bookmarkStart w:id="25" w:name="X24088c856cf357882496c34ac25964a75010f6a"/>
+        <w:t xml:space="preserve">سابعاً: المستندات والمعلومات التجارية المطلوبة</w:t>
+      </w:r>
+    </w:p>
+    <w:p>
+      <w:pPr>
+        <w:numPr>
+          <w:ilvl w:val="0"/>
+          <w:numId w:val="1005"/>
+        </w:numPr>
+        <w:pStyle w:val="Compact"/>
+        <w:bidi/>
+      </w:pPr>
+      <w:r>
+        <w:rPr>
+          <w:rtl/>
+        </w:rPr>
+        <w:t xml:space="preserve">أسماء المصانع التي سيتم التوريد منها، وبلد المنشأ الفعلي لكل منتج.</w:t>
+      </w:r>
+    </w:p>
+    <w:p>
+      <w:pPr>
+        <w:numPr>
+          <w:ilvl w:val="0"/>
+          <w:numId w:val="1005"/>
+        </w:numPr>
+        <w:pStyle w:val="Compact"/>
+        <w:bidi/>
+      </w:pPr>
+      <w:r>
+        <w:rPr>
+          <w:rtl/>
+        </w:rPr>
+        <w:t xml:space="preserve">شهادات الجودة والمطابقة المتوفرة، وشهادات المنشأ، لأن دخول المنتجات للمملكة يتطلب إجراءات المطابقة السعودية.</w:t>
+      </w:r>
+    </w:p>
+    <w:p>
+      <w:pPr>
+        <w:numPr>
+          <w:ilvl w:val="0"/>
+          <w:numId w:val="1005"/>
+        </w:numPr>
+        <w:pStyle w:val="Compact"/>
+        <w:bidi/>
+      </w:pPr>
+      <w:r>
+        <w:rPr>
+          <w:rtl/>
+        </w:rPr>
+        <w:t xml:space="preserve">قائمة أسعار لكل نموذج ومستوى تجهيز، بسعر المصنع وسعر التوصيل إلى ميناء جدة أو الدمام.</w:t>
+      </w:r>
+    </w:p>
+    <w:p>
+      <w:pPr>
+        <w:numPr>
+          <w:ilvl w:val="0"/>
+          <w:numId w:val="1005"/>
+        </w:numPr>
+        <w:pStyle w:val="Compact"/>
+        <w:bidi/>
+      </w:pPr>
+      <w:r>
+        <w:rPr>
+          <w:rtl/>
+        </w:rPr>
+        <w:t xml:space="preserve">الحد الأدنى للطلب، إن وجد.</w:t>
+      </w:r>
+    </w:p>
+    <w:bookmarkEnd w:id="26"/>
+    <w:bookmarkStart w:id="27" w:name="ثامناً-الخطوة-التالية"/>
     <w:p>
       <w:pPr>
         <w:pStyle w:val="Heading2"/>
@@ -1051,96 +1236,18 @@
         <w:rPr>
           <w:rtl/>
         </w:rPr>
-        <w:t xml:space="preserve">سادساً: المستندات والمعلومات التجارية المطلوبة</w:t>
-      </w:r>
-    </w:p>
-    <w:p>
-      <w:pPr>
-        <w:numPr>
-          <w:ilvl w:val="0"/>
-          <w:numId w:val="1005"/>
-        </w:numPr>
-        <w:pStyle w:val="Compact"/>
-        <w:bidi/>
-      </w:pPr>
-      <w:r>
-        <w:rPr>
-          <w:rtl/>
-        </w:rPr>
-        <w:t xml:space="preserve">أسماء المصانع التي سيتم التوريد منها، وبلد المنشأ الفعلي لكل منتج.</w:t>
-      </w:r>
-    </w:p>
-    <w:p>
-      <w:pPr>
-        <w:numPr>
-          <w:ilvl w:val="0"/>
-          <w:numId w:val="1005"/>
-        </w:numPr>
-        <w:pStyle w:val="Compact"/>
-        <w:bidi/>
-      </w:pPr>
-      <w:r>
-        <w:rPr>
-          <w:rtl/>
-        </w:rPr>
-        <w:t xml:space="preserve">شهادات الجودة والمطابقة المتوفرة، وشهادات المنشأ، لأن دخول المنتجات للمملكة يتطلب إجراءات المطابقة السعودية.</w:t>
-      </w:r>
-    </w:p>
-    <w:p>
-      <w:pPr>
-        <w:numPr>
-          <w:ilvl w:val="0"/>
-          <w:numId w:val="1005"/>
-        </w:numPr>
-        <w:pStyle w:val="Compact"/>
-        <w:bidi/>
-      </w:pPr>
-      <w:r>
-        <w:rPr>
-          <w:rtl/>
-        </w:rPr>
-        <w:t xml:space="preserve">قائمة أسعار لكل نموذج ومستوى تجهيز، بسعر المصنع وسعر التوصيل إلى ميناء جدة أو الدمام.</w:t>
-      </w:r>
-    </w:p>
-    <w:p>
-      <w:pPr>
-        <w:numPr>
-          <w:ilvl w:val="0"/>
-          <w:numId w:val="1005"/>
-        </w:numPr>
-        <w:pStyle w:val="Compact"/>
-        <w:bidi/>
-      </w:pPr>
-      <w:r>
-        <w:rPr>
-          <w:rtl/>
-        </w:rPr>
-        <w:t xml:space="preserve">الحد الأدنى للطلب.</w:t>
-      </w:r>
-    </w:p>
-    <w:bookmarkEnd w:id="25"/>
-    <w:bookmarkStart w:id="26" w:name="سابعاً-الخطوة-التالية"/>
-    <w:p>
-      <w:pPr>
-        <w:pStyle w:val="Heading2"/>
-        <w:bidi/>
-      </w:pPr>
-      <w:r>
-        <w:rPr>
-          <w:rtl/>
-        </w:rPr>
-        <w:t xml:space="preserve">سابعاً: الخطوة التالية</w:t>
-      </w:r>
-    </w:p>
-    <w:p>
-      <w:pPr>
-        <w:bidi/>
-      </w:pPr>
-      <w:r>
-        <w:rPr>
-          <w:rtl/>
-        </w:rPr>
-        <w:t xml:space="preserve">بعد استلام الأشكال والنماذج والمواصفات والأسعار، نختار منها ما يناسبنا ونحدد لكم المواصفات النهائية، ثم نتفق على شحنة العينات والتعاقد.</w:t>
+        <w:t xml:space="preserve">ثامناً: الخطوة التالية</w:t>
+      </w:r>
+    </w:p>
+    <w:p>
+      <w:pPr>
+        <w:bidi/>
+      </w:pPr>
+      <w:r>
+        <w:rPr>
+          <w:rtl/>
+        </w:rPr>
+        <w:t xml:space="preserve">بعد استلام الأشكال والنماذج والمواصفات والأسعار ومدد التوريد، نختار منها ما يناسبنا ونحدد لكم المواصفات النهائية، ثم نتفق على شحنة العينات والتعاقد.</w:t>
       </w:r>
     </w:p>
     <w:p>
@@ -1154,8 +1261,13 @@
         <w:t xml:space="preserve">نتطلع إلى ردكم، ولكم منا فائق الاحترام والتقدير.</w:t>
       </w:r>
     </w:p>
-    <w:bookmarkEnd w:id="26"/>
-    <w:sectPr/>
+    <w:bookmarkEnd w:id="27"/>
+    <w:sectPr>
+      <w:headerReference w:type="default" r:id="rId9"/>
+      <w:footerReference w:type="default" r:id="rId10"/>
+      <w:pgSz w:w="11906" w:h="16838"/>
+      <w:pgMar w:left="1020" w:right="1020" w:top="2778" w:bottom="1871" w:header="0" w:footer="0"/>
+    </w:sectPr>
   </w:body>
 </w:document>
 </file>
@@ -1164,6 +1276,51 @@
 <w:comments xmlns:w="http://schemas.openxmlformats.org/wordprocessingml/2006/main" xmlns:m="http://schemas.openxmlformats.org/officeDocument/2006/math" xmlns:r="http://schemas.openxmlformats.org/officeDocument/2006/relationships" xmlns:o="urn:schemas-microsoft-com:office:office" xmlns:v="urn:schemas-microsoft-com:vml" xmlns:w10="urn:schemas-microsoft-com:office:word" xmlns:a="http://schemas.openxmlformats.org/drawingml/2006/main" xmlns:pic="http://schemas.openxmlformats.org/drawingml/2006/picture" xmlns:wp="http://schemas.openxmlformats.org/drawingml/2006/wordprocessingDrawing"/>
 </file>
 
+<file path=word/footer1.xml><?xml version="1.0" encoding="utf-8"?>
+<w:ftr xmlns:m="http://schemas.openxmlformats.org/officeDocument/2006/math" xmlns:mc="http://schemas.openxmlformats.org/markup-compatibility/2006" xmlns:mo="http://schemas.microsoft.com/office/mac/office/2008/main" xmlns:mv="urn:schemas-microsoft-com:mac:vml" xmlns:o="urn:schemas-microsoft-com:office:office" xmlns:r="http://schemas.openxmlformats.org/officeDocument/2006/relationships" xmlns:v="urn:schemas-microsoft-com:vml" xmlns:w10="urn:schemas-microsoft-com:office:word" xmlns:w14="http://schemas.microsoft.com/office/word/2010/wordml" xmlns:w="http://schemas.openxmlformats.org/wordprocessingml/2006/main" xmlns:wne="http://schemas.microsoft.com/office/word/2006/wordml" xmlns:wp14="http://schemas.microsoft.com/office/word/2010/wordprocessingDrawing" xmlns:wp="http://schemas.openxmlformats.org/drawingml/2006/wordprocessingDrawing" xmlns:wpc="http://schemas.microsoft.com/office/word/2010/wordprocessingCanvas" xmlns:wpg="http://schemas.microsoft.com/office/word/2010/wordprocessingGroup" xmlns:wpi="http://schemas.microsoft.com/office/word/2010/wordprocessingInk" xmlns:wps="http://schemas.microsoft.com/office/word/2010/wordprocessingShape" mc:Ignorable="w14 wp14">
+  <w:p>
+    <w:pPr>
+      <w:pStyle w:val="Footer"/>
+      <w:ind w:left="-1020" w:right="-1020"/>
+    </w:pPr>
+    <w:r>
+      <w:drawing>
+        <wp:inline xmlns:a="http://schemas.openxmlformats.org/drawingml/2006/main" xmlns:pic="http://schemas.openxmlformats.org/drawingml/2006/picture">
+          <wp:extent cx="7524000" cy="972877"/>
+          <wp:docPr id="1" name="Picture 1"/>
+          <wp:cNvGraphicFramePr>
+            <a:graphicFrameLocks noChangeAspect="1"/>
+          </wp:cNvGraphicFramePr>
+          <a:graphic>
+            <a:graphicData uri="http://schemas.openxmlformats.org/drawingml/2006/picture">
+              <pic:pic>
+                <pic:nvPicPr>
+                  <pic:cNvPr id="0" name="lhimg-003.png"/>
+                  <pic:cNvPicPr/>
+                </pic:nvPicPr>
+                <pic:blipFill>
+                  <a:blip r:embed="rId1"/>
+                  <a:stretch>
+                    <a:fillRect/>
+                  </a:stretch>
+                </pic:blipFill>
+                <pic:spPr>
+                  <a:xfrm>
+                    <a:off x="0" y="0"/>
+                    <a:ext cx="7524000" cy="972877"/>
+                  </a:xfrm>
+                  <a:prstGeom prst="rect"/>
+                </pic:spPr>
+              </pic:pic>
+            </a:graphicData>
+          </a:graphic>
+        </wp:inline>
+      </w:drawing>
+    </w:r>
+  </w:p>
+</w:ftr>
+</file>
+
 <file path=word/footnotes.xml><?xml version="1.0" encoding="utf-8"?>
 <w:footnotes xmlns:w="http://schemas.openxmlformats.org/wordprocessingml/2006/main" xmlns:m="http://schemas.openxmlformats.org/officeDocument/2006/math" xmlns:r="http://schemas.openxmlformats.org/officeDocument/2006/relationships" xmlns:o="urn:schemas-microsoft-com:office:office" xmlns:v="urn:schemas-microsoft-com:vml" xmlns:w10="urn:schemas-microsoft-com:office:word" xmlns:a="http://schemas.openxmlformats.org/drawingml/2006/main" xmlns:pic="http://schemas.openxmlformats.org/drawingml/2006/picture" xmlns:wp="http://schemas.openxmlformats.org/drawingml/2006/wordprocessingDrawing">
   <w:footnote w:type="continuationSeparator" w:id="0">
@@ -1181,6 +1338,51 @@
     </w:p>
   </w:footnote>
 </w:footnotes>
+</file>
+
+<file path=word/header1.xml><?xml version="1.0" encoding="utf-8"?>
+<w:hdr xmlns:m="http://schemas.openxmlformats.org/officeDocument/2006/math" xmlns:mc="http://schemas.openxmlformats.org/markup-compatibility/2006" xmlns:mo="http://schemas.microsoft.com/office/mac/office/2008/main" xmlns:mv="urn:schemas-microsoft-com:mac:vml" xmlns:o="urn:schemas-microsoft-com:office:office" xmlns:r="http://schemas.openxmlformats.org/officeDocument/2006/relationships" xmlns:v="urn:schemas-microsoft-com:vml" xmlns:w10="urn:schemas-microsoft-com:office:word" xmlns:w14="http://schemas.microsoft.com/office/word/2010/wordml" xmlns:w="http://schemas.openxmlformats.org/wordprocessingml/2006/main" xmlns:wne="http://schemas.microsoft.com/office/word/2006/wordml" xmlns:wp14="http://schemas.microsoft.com/office/word/2010/wordprocessingDrawing" xmlns:wp="http://schemas.openxmlformats.org/drawingml/2006/wordprocessingDrawing" xmlns:wpc="http://schemas.microsoft.com/office/word/2010/wordprocessingCanvas" xmlns:wpg="http://schemas.microsoft.com/office/word/2010/wordprocessingGroup" xmlns:wpi="http://schemas.microsoft.com/office/word/2010/wordprocessingInk" xmlns:wps="http://schemas.microsoft.com/office/word/2010/wordprocessingShape" mc:Ignorable="w14 wp14">
+  <w:p>
+    <w:pPr>
+      <w:pStyle w:val="Header"/>
+      <w:ind w:left="-1020" w:right="-1020"/>
+    </w:pPr>
+    <w:r>
+      <w:drawing>
+        <wp:inline xmlns:a="http://schemas.openxmlformats.org/drawingml/2006/main" xmlns:pic="http://schemas.openxmlformats.org/drawingml/2006/picture">
+          <wp:extent cx="7524000" cy="1421411"/>
+          <wp:docPr id="1" name="Picture 1"/>
+          <wp:cNvGraphicFramePr>
+            <a:graphicFrameLocks noChangeAspect="1"/>
+          </wp:cNvGraphicFramePr>
+          <a:graphic>
+            <a:graphicData uri="http://schemas.openxmlformats.org/drawingml/2006/picture">
+              <pic:pic>
+                <pic:nvPicPr>
+                  <pic:cNvPr id="0" name="lhimg-002.png"/>
+                  <pic:cNvPicPr/>
+                </pic:nvPicPr>
+                <pic:blipFill>
+                  <a:blip r:embed="rId1"/>
+                  <a:stretch>
+                    <a:fillRect/>
+                  </a:stretch>
+                </pic:blipFill>
+                <pic:spPr>
+                  <a:xfrm>
+                    <a:off x="0" y="0"/>
+                    <a:ext cx="7524000" cy="1421411"/>
+                  </a:xfrm>
+                  <a:prstGeom prst="rect"/>
+                </pic:spPr>
+              </pic:pic>
+            </a:graphicData>
+          </a:graphic>
+        </wp:inline>
+      </w:drawing>
+    </w:r>
+  </w:p>
+</w:hdr>
 </file>
 
 <file path=word/numbering.xml><?xml version="1.0" encoding="utf-8"?>
@@ -1523,6 +1725,9 @@
   <w:style w:default="1" w:styleId="Normal" w:type="paragraph">
     <w:name w:val="Normal"/>
     <w:qFormat/>
+    <w:rPr>
+      <w:rFonts w:ascii="Arial" w:hAnsi="Arial" w:cs="Arial"/>
+    </w:rPr>
   </w:style>
   <w:style w:styleId="BodyText" w:type="paragraph">
     <w:name w:val="Body Text"/>
@@ -1532,12 +1737,18 @@
       <w:spacing w:after="180" w:before="180"/>
     </w:pPr>
     <w:qFormat/>
+    <w:rPr>
+      <w:rFonts w:ascii="Arial" w:hAnsi="Arial" w:cs="Arial"/>
+    </w:rPr>
   </w:style>
   <w:style w:customStyle="1" w:styleId="FirstParagraph" w:type="paragraph">
     <w:name w:val="First Paragraph"/>
     <w:basedOn w:val="BodyText"/>
     <w:next w:val="BodyText"/>
     <w:qFormat/>
+    <w:rPr>
+      <w:rFonts w:ascii="Arial" w:hAnsi="Arial" w:cs="Arial"/>
+    </w:rPr>
   </w:style>
   <w:style w:customStyle="1" w:styleId="Compact" w:type="paragraph">
     <w:name w:val="Compact"/>
@@ -1546,6 +1757,9 @@
     <w:pPr>
       <w:spacing w:after="36" w:before="36"/>
     </w:pPr>
+    <w:rPr>
+      <w:rFonts w:ascii="Arial" w:hAnsi="Arial" w:cs="Arial"/>
+    </w:rPr>
   </w:style>
   <w:style w:styleId="Title" w:type="paragraph">
     <w:name w:val="Title"/>
@@ -1559,7 +1773,7 @@
       <w:jc w:val="center"/>
     </w:pPr>
     <w:rPr>
-      <w:rFonts w:asciiTheme="majorHAnsi" w:cstheme="majorBidi" w:eastAsiaTheme="majorEastAsia" w:hAnsiTheme="majorHAnsi"/>
+      <w:rFonts w:asciiTheme="majorHAnsi" w:cstheme="majorBidi" w:eastAsiaTheme="majorEastAsia" w:hAnsiTheme="majorHAnsi" w:ascii="Arial" w:hAnsi="Arial" w:cs="Arial"/>
       <w:b/>
       <w:bCs/>
       <w:color w:themeColor="accent1" w:themeShade="B5" w:val="345A8A"/>
@@ -1579,6 +1793,7 @@
       <w:jc w:val="center"/>
     </w:pPr>
     <w:rPr>
+      <w:rFonts w:ascii="Arial" w:hAnsi="Arial" w:cs="Arial"/>
       <w:sz w:val="30"/>
       <w:szCs w:val="30"/>
     </w:rPr>
@@ -1592,6 +1807,9 @@
       <w:keepLines/>
       <w:jc w:val="center"/>
     </w:pPr>
+    <w:rPr>
+      <w:rFonts w:ascii="Arial" w:hAnsi="Arial" w:cs="Arial"/>
+    </w:rPr>
   </w:style>
   <w:style w:styleId="Date" w:type="paragraph">
     <w:name w:val="Date"/>
@@ -1602,6 +1820,9 @@
       <w:keepLines/>
       <w:jc w:val="center"/>
     </w:pPr>
+    <w:rPr>
+      <w:rFonts w:ascii="Arial" w:hAnsi="Arial" w:cs="Arial"/>
+    </w:rPr>
   </w:style>
   <w:style w:customStyle="1" w:styleId="AbstractTitle" w:type="paragraph">
     <w:name w:val="Abstract Title"/>
@@ -1617,6 +1838,7 @@
     <w:rPr>
       <w:sz w:val="20"/>
       <w:szCs w:val="20"/>
+      <w:rFonts w:ascii="Arial" w:hAnsi="Arial" w:cs="Arial"/>
       <w:b/>
       <w:color w:val="345A8A"/>
       &gt;
@@ -1633,6 +1855,7 @@
       <w:spacing w:after="300" w:before="100"/>
     </w:pPr>
     <w:rPr>
+      <w:rFonts w:ascii="Arial" w:hAnsi="Arial" w:cs="Arial"/>
       <w:sz w:val="20"/>
       <w:szCs w:val="20"/>
     </w:rPr>
@@ -1643,7 +1866,9 @@
     <w:next w:val="Bibliography"/>
     <w:qFormat/>
     <w:pPr/>
-    <w:rPr/>
+    <w:rPr>
+      <w:rFonts w:ascii="Arial" w:hAnsi="Arial" w:cs="Arial"/>
+    </w:rPr>
   </w:style>
   <w:style w:styleId="Heading1" w:type="paragraph">
     <w:name w:val="Heading 1"/>
@@ -1658,10 +1883,10 @@
       <w:outlineLvl w:val="0"/>
     </w:pPr>
     <w:rPr>
-      <w:rFonts w:asciiTheme="majorHAnsi" w:cstheme="majorBidi" w:eastAsiaTheme="majorEastAsia" w:hAnsiTheme="majorHAnsi"/>
+      <w:rFonts w:asciiTheme="majorHAnsi" w:cstheme="majorBidi" w:eastAsiaTheme="majorEastAsia" w:hAnsiTheme="majorHAnsi" w:ascii="Arial" w:hAnsi="Arial" w:cs="Arial"/>
       <w:b/>
       <w:bCs/>
-      <w:color w:themeColor="accent1" w:val="4F81BD"/>
+      <w:color w:val="4A1410"/>
       <w:sz w:val="32"/>
       <w:szCs w:val="32"/>
     </w:rPr>
@@ -1680,10 +1905,10 @@
       <w:outlineLvl w:val="1"/>
     </w:pPr>
     <w:rPr>
-      <w:rFonts w:asciiTheme="majorHAnsi" w:cstheme="majorBidi" w:eastAsiaTheme="majorEastAsia" w:hAnsiTheme="majorHAnsi"/>
+      <w:rFonts w:asciiTheme="majorHAnsi" w:cstheme="majorBidi" w:eastAsiaTheme="majorEastAsia" w:hAnsiTheme="majorHAnsi" w:ascii="Arial" w:hAnsi="Arial" w:cs="Arial"/>
       <w:b/>
       <w:bCs/>
-      <w:color w:themeColor="accent1" w:val="4F81BD"/>
+      <w:color w:val="4A1410"/>
       <w:sz w:val="28"/>
       <w:szCs w:val="28"/>
     </w:rPr>
@@ -1702,10 +1927,10 @@
       <w:outlineLvl w:val="2"/>
     </w:pPr>
     <w:rPr>
-      <w:rFonts w:asciiTheme="majorHAnsi" w:cstheme="majorBidi" w:eastAsiaTheme="majorEastAsia" w:hAnsiTheme="majorHAnsi"/>
+      <w:rFonts w:asciiTheme="majorHAnsi" w:cstheme="majorBidi" w:eastAsiaTheme="majorEastAsia" w:hAnsiTheme="majorHAnsi" w:ascii="Arial" w:hAnsi="Arial" w:cs="Arial"/>
       <w:b/>
       <w:bCs/>
-      <w:color w:themeColor="accent1" w:val="4F81BD"/>
+      <w:color w:val="4A1410"/>
       <w:sz w:val="24"/>
       <w:szCs w:val="24"/>
     </w:rPr>
@@ -1724,10 +1949,10 @@
       <w:outlineLvl w:val="3"/>
     </w:pPr>
     <w:rPr>
-      <w:rFonts w:asciiTheme="majorHAnsi" w:cstheme="majorBidi" w:eastAsiaTheme="majorEastAsia" w:hAnsiTheme="majorHAnsi"/>
+      <w:rFonts w:asciiTheme="majorHAnsi" w:cstheme="majorBidi" w:eastAsiaTheme="majorEastAsia" w:hAnsiTheme="majorHAnsi" w:ascii="Arial" w:hAnsi="Arial" w:cs="Arial"/>
       <w:i/>
       <w:bCs/>
-      <w:color w:themeColor="accent1" w:val="4F81BD"/>
+      <w:color w:val="4A1410"/>
       <w:sz w:val="24"/>
       <w:szCs w:val="24"/>
     </w:rPr>
@@ -1746,9 +1971,9 @@
       <w:outlineLvl w:val="4"/>
     </w:pPr>
     <w:rPr>
-      <w:rFonts w:asciiTheme="majorHAnsi" w:cstheme="majorBidi" w:eastAsiaTheme="majorEastAsia" w:hAnsiTheme="majorHAnsi"/>
+      <w:rFonts w:asciiTheme="majorHAnsi" w:cstheme="majorBidi" w:eastAsiaTheme="majorEastAsia" w:hAnsiTheme="majorHAnsi" w:ascii="Arial" w:hAnsi="Arial" w:cs="Arial"/>
       <w:iCs/>
-      <w:color w:themeColor="accent1" w:val="4F81BD"/>
+      <w:color w:val="4A1410"/>
       <w:sz w:val="24"/>
       <w:szCs w:val="24"/>
     </w:rPr>
@@ -1767,8 +1992,8 @@
       <w:outlineLvl w:val="5"/>
     </w:pPr>
     <w:rPr>
-      <w:rFonts w:asciiTheme="majorHAnsi" w:cstheme="majorBidi" w:eastAsiaTheme="majorEastAsia" w:hAnsiTheme="majorHAnsi"/>
-      <w:color w:themeColor="accent1" w:val="4F81BD"/>
+      <w:rFonts w:asciiTheme="majorHAnsi" w:cstheme="majorBidi" w:eastAsiaTheme="majorEastAsia" w:hAnsiTheme="majorHAnsi" w:ascii="Arial" w:hAnsi="Arial" w:cs="Arial"/>
+      <w:color w:val="4A1410"/>
       <w:sz w:val="24"/>
       <w:szCs w:val="24"/>
     </w:rPr>
@@ -1787,8 +2012,8 @@
       <w:outlineLvl w:val="6"/>
     </w:pPr>
     <w:rPr>
-      <w:rFonts w:asciiTheme="majorHAnsi" w:cstheme="majorBidi" w:eastAsiaTheme="majorEastAsia" w:hAnsiTheme="majorHAnsi"/>
-      <w:color w:themeColor="accent1" w:val="4F81BD"/>
+      <w:rFonts w:asciiTheme="majorHAnsi" w:cstheme="majorBidi" w:eastAsiaTheme="majorEastAsia" w:hAnsiTheme="majorHAnsi" w:ascii="Arial" w:hAnsi="Arial" w:cs="Arial"/>
+      <w:color w:val="4A1410"/>
       <w:sz w:val="24"/>
       <w:szCs w:val="24"/>
     </w:rPr>
@@ -1807,8 +2032,8 @@
       <w:outlineLvl w:val="7"/>
     </w:pPr>
     <w:rPr>
-      <w:rFonts w:asciiTheme="majorHAnsi" w:cstheme="majorBidi" w:eastAsiaTheme="majorEastAsia" w:hAnsiTheme="majorHAnsi"/>
-      <w:color w:themeColor="accent1" w:val="4F81BD"/>
+      <w:rFonts w:asciiTheme="majorHAnsi" w:cstheme="majorBidi" w:eastAsiaTheme="majorEastAsia" w:hAnsiTheme="majorHAnsi" w:ascii="Arial" w:hAnsi="Arial" w:cs="Arial"/>
+      <w:color w:val="4A1410"/>
       <w:sz w:val="24"/>
       <w:szCs w:val="24"/>
     </w:rPr>
@@ -1827,8 +2052,8 @@
       <w:outlineLvl w:val="8"/>
     </w:pPr>
     <w:rPr>
-      <w:rFonts w:asciiTheme="majorHAnsi" w:cstheme="majorBidi" w:eastAsiaTheme="majorEastAsia" w:hAnsiTheme="majorHAnsi"/>
-      <w:color w:themeColor="accent1" w:val="4F81BD"/>
+      <w:rFonts w:asciiTheme="majorHAnsi" w:cstheme="majorBidi" w:eastAsiaTheme="majorEastAsia" w:hAnsiTheme="majorHAnsi" w:ascii="Arial" w:hAnsi="Arial" w:cs="Arial"/>
+      <w:color w:val="4A1410"/>
       <w:sz w:val="24"/>
       <w:szCs w:val="24"/>
     </w:rPr>
@@ -1844,6 +2069,9 @@
       <w:spacing w:after="100" w:before="100"/>
       <w:ind w:firstLine="0" w:left="480" w:right="480"/>
     </w:pPr>
+    <w:rPr>
+      <w:rFonts w:ascii="Arial" w:hAnsi="Arial" w:cs="Arial"/>
+    </w:rPr>
   </w:style>
   <w:style w:styleId="FootnoteText" w:type="paragraph">
     <w:name w:val="Footnote Text"/>
@@ -1852,6 +2080,9 @@
     <w:uiPriority w:val="9"/>
     <w:unhideWhenUsed/>
     <w:qFormat/>
+    <w:rPr>
+      <w:rFonts w:ascii="Arial" w:hAnsi="Arial" w:cs="Arial"/>
+    </w:rPr>
   </w:style>
   <w:style w:default="1" w:styleId="DefaultParagraphFont" w:type="character">
     <w:name w:val="Default Paragraph Font"/>
@@ -1899,12 +2130,16 @@
       <w:spacing w:after="0"/>
     </w:pPr>
     <w:rPr>
+      <w:rFonts w:ascii="Arial" w:hAnsi="Arial" w:cs="Arial"/>
       <w:b/>
     </w:rPr>
   </w:style>
   <w:style w:customStyle="1" w:styleId="Definition" w:type="paragraph">
     <w:name w:val="Definition"/>
     <w:basedOn w:val="Normal"/>
+    <w:rPr>
+      <w:rFonts w:ascii="Arial" w:hAnsi="Arial" w:cs="Arial"/>
+    </w:rPr>
   </w:style>
   <w:style w:styleId="Caption" w:type="paragraph">
     <w:name w:val="Caption"/>
@@ -1914,6 +2149,7 @@
       <w:spacing w:after="120" w:before="0"/>
     </w:pPr>
     <w:rPr>
+      <w:rFonts w:ascii="Arial" w:hAnsi="Arial" w:cs="Arial"/>
       <w:i/>
     </w:rPr>
   </w:style>
@@ -1923,14 +2159,23 @@
     <w:pPr>
       <w:keepNext/>
     </w:pPr>
+    <w:rPr>
+      <w:rFonts w:ascii="Arial" w:hAnsi="Arial" w:cs="Arial"/>
+    </w:rPr>
   </w:style>
   <w:style w:customStyle="1" w:styleId="ImageCaption" w:type="paragraph">
     <w:name w:val="Image Caption"/>
     <w:basedOn w:val="Caption"/>
+    <w:rPr>
+      <w:rFonts w:ascii="Arial" w:hAnsi="Arial" w:cs="Arial"/>
+    </w:rPr>
   </w:style>
   <w:style w:customStyle="1" w:styleId="Figure" w:type="paragraph">
     <w:name w:val="Figure"/>
     <w:basedOn w:val="Normal"/>
+    <w:rPr>
+      <w:rFonts w:ascii="Arial" w:hAnsi="Arial" w:cs="Arial"/>
+    </w:rPr>
   </w:style>
   <w:style w:customStyle="1" w:styleId="CaptionedFigure" w:type="paragraph">
     <w:name w:val="Captioned Figure"/>
@@ -1938,6 +2183,9 @@
     <w:pPr>
       <w:keepNext/>
     </w:pPr>
+    <w:rPr>
+      <w:rFonts w:ascii="Arial" w:hAnsi="Arial" w:cs="Arial"/>
+    </w:rPr>
   </w:style>
   <w:style w:customStyle="1" w:styleId="BodyTextChar" w:type="character">
     <w:name w:val="Body Text Char"/>
@@ -1982,7 +2230,7 @@
       <w:outlineLvl w:val="9"/>
     </w:pPr>
     <w:rPr>
-      <w:rFonts w:asciiTheme="majorHAnsi" w:cstheme="majorBidi" w:eastAsiaTheme="majorEastAsia" w:hAnsiTheme="majorHAnsi"/>
+      <w:rFonts w:asciiTheme="majorHAnsi" w:cstheme="majorBidi" w:eastAsiaTheme="majorEastAsia" w:hAnsiTheme="majorHAnsi" w:ascii="Arial" w:hAnsi="Arial" w:cs="Arial"/>
       <w:b w:val="0"/>
       <w:bCs w:val="0"/>
       <w:color w:themeColor="accent1" w:themeShade="BF" w:val="365F91"/>
@@ -1995,6 +2243,9 @@
     <w:pPr>
       <w:wordWrap w:val="off"/>
     </w:pPr>
+    <w:rPr>
+      <w:rFonts w:ascii="Arial" w:hAnsi="Arial" w:cs="Arial"/>
+    </w:rPr>
   </w:style>
   <w:style w:type="character" w:customStyle="1" w:styleId="KeywordTok">
     <w:name w:val="KeywordTok"/>

</xml_diff>